<commit_message>
docs(j4): propage le passage a l'echelle aux artefacts canonique
</commit_message>
<xml_diff>
--- a/docs/cadrage/equipe-6-product-backlog-v1.0.docx
+++ b/docs/cadrage/equipe-6-product-backlog-v1.0.docx
@@ -2108,6 +2108,204 @@
           </w:p>
         </w:tc>
       </w:tr>
+      <w:tr>
+        <w:tc>
+          <w:tcPr>
+            <w:tcW w:type="dxa" w:w="1728"/>
+          </w:tcPr>
+          <w:p>
+            <w:r/>
+            <w:r>
+              <w:rPr>
+                <w:b/>
+              </w:rPr>
+              <w:t>E14</w:t>
+            </w:r>
+          </w:p>
+        </w:tc>
+        <w:tc>
+          <w:tcPr>
+            <w:tcW w:type="dxa" w:w="1728"/>
+          </w:tcPr>
+          <w:p>
+            <w:r/>
+            <w:r>
+              <w:t xml:space="preserve">Scalabilité nationale </w:t>
+            </w:r>
+            <w:r>
+              <w:rPr>
+                <w:i/>
+              </w:rPr>
+              <w:t>(perturbation J4)</w:t>
+            </w:r>
+          </w:p>
+        </w:tc>
+        <w:tc>
+          <w:tcPr>
+            <w:tcW w:type="dxa" w:w="1728"/>
+          </w:tcPr>
+          <w:p>
+            <w:r/>
+            <w:r>
+              <w:t>File de génération, workers, autoscaling, cache/CDN, observabilité coûts</w:t>
+            </w:r>
+          </w:p>
+        </w:tc>
+        <w:tc>
+          <w:tcPr>
+            <w:tcW w:type="dxa" w:w="1728"/>
+          </w:tcPr>
+          <w:p>
+            <w:r/>
+            <w:r>
+              <w:t>R3</w:t>
+            </w:r>
+          </w:p>
+        </w:tc>
+        <w:tc>
+          <w:tcPr>
+            <w:tcW w:type="dxa" w:w="1728"/>
+          </w:tcPr>
+          <w:p>
+            <w:r/>
+            <w:r>
+              <w:t>P-J4</w:t>
+            </w:r>
+          </w:p>
+        </w:tc>
+      </w:tr>
+      <w:tr>
+        <w:tc>
+          <w:tcPr>
+            <w:tcW w:type="dxa" w:w="1728"/>
+          </w:tcPr>
+          <w:p>
+            <w:r/>
+            <w:r>
+              <w:rPr>
+                <w:b/>
+              </w:rPr>
+              <w:t>E15</w:t>
+            </w:r>
+          </w:p>
+        </w:tc>
+        <w:tc>
+          <w:tcPr>
+            <w:tcW w:type="dxa" w:w="1728"/>
+          </w:tcPr>
+          <w:p>
+            <w:r/>
+            <w:r>
+              <w:t xml:space="preserve">Accessibilité RGAA </w:t>
+            </w:r>
+            <w:r>
+              <w:rPr>
+                <w:i/>
+              </w:rPr>
+              <w:t>(perturbation J4)</w:t>
+            </w:r>
+          </w:p>
+        </w:tc>
+        <w:tc>
+          <w:tcPr>
+            <w:tcW w:type="dxa" w:w="1728"/>
+          </w:tcPr>
+          <w:p>
+            <w:r/>
+            <w:r>
+              <w:t>Audit RGAA, navigation clavier, contrastes, ARIA, tests automatisés</w:t>
+            </w:r>
+          </w:p>
+        </w:tc>
+        <w:tc>
+          <w:tcPr>
+            <w:tcW w:type="dxa" w:w="1728"/>
+          </w:tcPr>
+          <w:p>
+            <w:r/>
+            <w:r>
+              <w:t>R3</w:t>
+            </w:r>
+          </w:p>
+        </w:tc>
+        <w:tc>
+          <w:tcPr>
+            <w:tcW w:type="dxa" w:w="1728"/>
+          </w:tcPr>
+          <w:p>
+            <w:r/>
+            <w:r>
+              <w:t>P-J4</w:t>
+            </w:r>
+          </w:p>
+        </w:tc>
+      </w:tr>
+      <w:tr>
+        <w:tc>
+          <w:tcPr>
+            <w:tcW w:type="dxa" w:w="1728"/>
+          </w:tcPr>
+          <w:p>
+            <w:r/>
+            <w:r>
+              <w:rPr>
+                <w:b/>
+              </w:rPr>
+              <w:t>E16</w:t>
+            </w:r>
+          </w:p>
+        </w:tc>
+        <w:tc>
+          <w:tcPr>
+            <w:tcW w:type="dxa" w:w="1728"/>
+          </w:tcPr>
+          <w:p>
+            <w:r/>
+            <w:r>
+              <w:t xml:space="preserve">Internationalisation i18n </w:t>
+            </w:r>
+            <w:r>
+              <w:rPr>
+                <w:i/>
+              </w:rPr>
+              <w:t>(perturbation J4)</w:t>
+            </w:r>
+          </w:p>
+        </w:tc>
+        <w:tc>
+          <w:tcPr>
+            <w:tcW w:type="dxa" w:w="1728"/>
+          </w:tcPr>
+          <w:p>
+            <w:r/>
+            <w:r>
+              <w:t>Interface multilingue, prompts localisés, qualité IA par langue</w:t>
+            </w:r>
+          </w:p>
+        </w:tc>
+        <w:tc>
+          <w:tcPr>
+            <w:tcW w:type="dxa" w:w="1728"/>
+          </w:tcPr>
+          <w:p>
+            <w:r/>
+            <w:r>
+              <w:t>R3</w:t>
+            </w:r>
+          </w:p>
+        </w:tc>
+        <w:tc>
+          <w:tcPr>
+            <w:tcW w:type="dxa" w:w="1728"/>
+          </w:tcPr>
+          <w:p>
+            <w:r/>
+            <w:r>
+              <w:t>P-J4</w:t>
+            </w:r>
+          </w:p>
+        </w:tc>
+      </w:tr>
     </w:tbl>
     <w:p/>
     <w:p>
@@ -6370,19 +6568,10 @@
         <w:rPr>
           <w:b/>
         </w:rPr>
-        <w:t>📌 P5 — Livraison/Crise (jeudi 10h).</w:t>
+        <w:t>📌 P5 / J4 — Passage à l'échelle (jeudi 10h).</w:t>
       </w:r>
       <w:r>
-        <w:t xml:space="preserve"> Préparer rollback rapide (</w:t>
-      </w:r>
-      <w:r>
-        <w:rPr>
-          <w:rFonts w:ascii="Consolas" w:hAnsi="Consolas"/>
-        </w:rPr>
-        <w:t>--fast</w:t>
-      </w:r>
-      <w:r>
-        <w:t xml:space="preserve">), checklist de démo et template post-mortem → </w:t>
+        <w:t xml:space="preserve"> Préparer la matrice de risques, la repriorisation MoSCoW, le backlog préventif et le burnup actualisé → </w:t>
       </w:r>
       <w:r>
         <w:rPr>
@@ -7868,6 +8057,1072 @@
         <w:pStyle w:val="Heading1"/>
       </w:pPr>
       <w:r>
+        <w:t>5bis. RELEASE 3 — Plateforme publique nationale *(J4 : RGAA · i18n · scalabilité)*</w:t>
+      </w:r>
+    </w:p>
+    <w:p>
+      <w:pPr>
+        <w:ind w:left="454"/>
+      </w:pPr>
+      <w:r>
+        <w:rPr>
+          <w:b/>
+        </w:rPr>
+        <w:t>Mise à jour J4.</w:t>
+      </w:r>
+      <w:r>
+        <w:t xml:space="preserve"> Le succès viral et l'intérêt de l'État ajoutent un périmètre de </w:t>
+      </w:r>
+      <w:r>
+        <w:rPr>
+          <w:b/>
+        </w:rPr>
+        <w:t>68 points</w:t>
+      </w:r>
+      <w:r>
+        <w:t xml:space="preserve">. Ces stories ne sont pas glissées en douce dans la Release 2 : elles forment une </w:t>
+      </w:r>
+      <w:r>
+        <w:rPr>
+          <w:b/>
+        </w:rPr>
+        <w:t>Release 3 « Plateforme publique »</w:t>
+      </w:r>
+      <w:r>
+        <w:t>, priorisée par risques et tracée dans j4-passage-echelle.md et j4-burndown-burnup.md.</w:t>
+      </w:r>
+    </w:p>
+    <w:p>
+      <w:pPr>
+        <w:pStyle w:val="Heading1"/>
+      </w:pPr>
+      <w:r>
+        <w:t>E14 — Scalabilité nationale</w:t>
+      </w:r>
+    </w:p>
+    <w:tbl>
+      <w:tblPr>
+        <w:tblStyle w:val="LightGrid-Accent1"/>
+        <w:tblW w:type="auto" w:w="0"/>
+        <w:jc w:val="center"/>
+        <w:tblLook w:firstColumn="1" w:firstRow="1" w:lastColumn="0" w:lastRow="0" w:noHBand="0" w:noVBand="1" w:val="04A0"/>
+      </w:tblPr>
+      <w:tblGrid>
+        <w:gridCol w:w="1440"/>
+        <w:gridCol w:w="1440"/>
+        <w:gridCol w:w="1440"/>
+        <w:gridCol w:w="1440"/>
+        <w:gridCol w:w="1440"/>
+        <w:gridCol w:w="1440"/>
+      </w:tblGrid>
+      <w:tr>
+        <w:tc>
+          <w:tcPr>
+            <w:tcW w:type="dxa" w:w="1440"/>
+          </w:tcPr>
+          <w:p>
+            <w:r/>
+            <w:r>
+              <w:rPr>
+                <w:b/>
+              </w:rPr>
+              <w:t>ID</w:t>
+            </w:r>
+          </w:p>
+        </w:tc>
+        <w:tc>
+          <w:tcPr>
+            <w:tcW w:type="dxa" w:w="1440"/>
+          </w:tcPr>
+          <w:p>
+            <w:r/>
+            <w:r>
+              <w:rPr>
+                <w:b/>
+              </w:rPr>
+              <w:t>User Story</w:t>
+            </w:r>
+          </w:p>
+        </w:tc>
+        <w:tc>
+          <w:tcPr>
+            <w:tcW w:type="dxa" w:w="1440"/>
+          </w:tcPr>
+          <w:p>
+            <w:r/>
+            <w:r>
+              <w:rPr>
+                <w:b/>
+              </w:rPr>
+              <w:t>Risque couvert</w:t>
+            </w:r>
+          </w:p>
+        </w:tc>
+        <w:tc>
+          <w:tcPr>
+            <w:tcW w:type="dxa" w:w="1440"/>
+          </w:tcPr>
+          <w:p>
+            <w:r/>
+            <w:r>
+              <w:rPr>
+                <w:b/>
+              </w:rPr>
+              <w:t>MoSCoW</w:t>
+            </w:r>
+          </w:p>
+        </w:tc>
+        <w:tc>
+          <w:tcPr>
+            <w:tcW w:type="dxa" w:w="1440"/>
+          </w:tcPr>
+          <w:p>
+            <w:r/>
+            <w:r>
+              <w:rPr>
+                <w:b/>
+              </w:rPr>
+              <w:t>Pts</w:t>
+            </w:r>
+          </w:p>
+        </w:tc>
+        <w:tc>
+          <w:tcPr>
+            <w:tcW w:type="dxa" w:w="1440"/>
+          </w:tcPr>
+          <w:p>
+            <w:r/>
+            <w:r>
+              <w:rPr>
+                <w:b/>
+              </w:rPr>
+              <w:t>État code</w:t>
+            </w:r>
+          </w:p>
+        </w:tc>
+      </w:tr>
+      <w:tr>
+        <w:tc>
+          <w:tcPr>
+            <w:tcW w:type="dxa" w:w="1440"/>
+          </w:tcPr>
+          <w:p>
+            <w:r/>
+            <w:r>
+              <w:t>US-SC.1</w:t>
+            </w:r>
+          </w:p>
+        </w:tc>
+        <w:tc>
+          <w:tcPr>
+            <w:tcW w:type="dxa" w:w="1440"/>
+          </w:tcPr>
+          <w:p>
+            <w:r/>
+            <w:r>
+              <w:t xml:space="preserve">En tant qu'équipe, nous voulons une </w:t>
+            </w:r>
+            <w:r>
+              <w:rPr>
+                <w:b/>
+              </w:rPr>
+              <w:t>génération de quiz asynchrone</w:t>
+            </w:r>
+            <w:r>
+              <w:t xml:space="preserve"> (file + workers) afin d'encaisser des pics nationaux.</w:t>
+            </w:r>
+          </w:p>
+        </w:tc>
+        <w:tc>
+          <w:tcPr>
+            <w:tcW w:type="dxa" w:w="1440"/>
+          </w:tcPr>
+          <w:p>
+            <w:r/>
+            <w:r>
+              <w:t>R1</w:t>
+            </w:r>
+          </w:p>
+        </w:tc>
+        <w:tc>
+          <w:tcPr>
+            <w:tcW w:type="dxa" w:w="1440"/>
+          </w:tcPr>
+          <w:p>
+            <w:r/>
+            <w:r>
+              <w:t>🔴 M</w:t>
+            </w:r>
+          </w:p>
+        </w:tc>
+        <w:tc>
+          <w:tcPr>
+            <w:tcW w:type="dxa" w:w="1440"/>
+          </w:tcPr>
+          <w:p>
+            <w:r/>
+            <w:r>
+              <w:t>13</w:t>
+            </w:r>
+          </w:p>
+        </w:tc>
+        <w:tc>
+          <w:tcPr>
+            <w:tcW w:type="dxa" w:w="1440"/>
+          </w:tcPr>
+          <w:p>
+            <w:r/>
+            <w:r>
+              <w:t>⬜</w:t>
+            </w:r>
+          </w:p>
+        </w:tc>
+      </w:tr>
+      <w:tr>
+        <w:tc>
+          <w:tcPr>
+            <w:tcW w:type="dxa" w:w="1440"/>
+          </w:tcPr>
+          <w:p>
+            <w:r/>
+            <w:r>
+              <w:t>US-SC.2</w:t>
+            </w:r>
+          </w:p>
+        </w:tc>
+        <w:tc>
+          <w:tcPr>
+            <w:tcW w:type="dxa" w:w="1440"/>
+          </w:tcPr>
+          <w:p>
+            <w:r/>
+            <w:r>
+              <w:t xml:space="preserve">En tant qu'équipe, nous voulons un </w:t>
+            </w:r>
+            <w:r>
+              <w:rPr>
+                <w:b/>
+              </w:rPr>
+              <w:t>repli LLM managé UE</w:t>
+            </w:r>
+            <w:r>
+              <w:t xml:space="preserve"> activable par feature-flag afin d'absorber le débordement du LLM local.</w:t>
+            </w:r>
+          </w:p>
+        </w:tc>
+        <w:tc>
+          <w:tcPr>
+            <w:tcW w:type="dxa" w:w="1440"/>
+          </w:tcPr>
+          <w:p>
+            <w:r/>
+            <w:r>
+              <w:t>R2</w:t>
+            </w:r>
+          </w:p>
+        </w:tc>
+        <w:tc>
+          <w:tcPr>
+            <w:tcW w:type="dxa" w:w="1440"/>
+          </w:tcPr>
+          <w:p>
+            <w:r/>
+            <w:r>
+              <w:t>🔴 M</w:t>
+            </w:r>
+          </w:p>
+        </w:tc>
+        <w:tc>
+          <w:tcPr>
+            <w:tcW w:type="dxa" w:w="1440"/>
+          </w:tcPr>
+          <w:p>
+            <w:r/>
+            <w:r>
+              <w:t>8</w:t>
+            </w:r>
+          </w:p>
+        </w:tc>
+        <w:tc>
+          <w:tcPr>
+            <w:tcW w:type="dxa" w:w="1440"/>
+          </w:tcPr>
+          <w:p>
+            <w:r/>
+            <w:r>
+              <w:t>⬜</w:t>
+            </w:r>
+          </w:p>
+        </w:tc>
+      </w:tr>
+      <w:tr>
+        <w:tc>
+          <w:tcPr>
+            <w:tcW w:type="dxa" w:w="1440"/>
+          </w:tcPr>
+          <w:p>
+            <w:r/>
+            <w:r>
+              <w:t>US-SC.3</w:t>
+            </w:r>
+          </w:p>
+        </w:tc>
+        <w:tc>
+          <w:tcPr>
+            <w:tcW w:type="dxa" w:w="1440"/>
+          </w:tcPr>
+          <w:p>
+            <w:r/>
+            <w:r>
+              <w:t xml:space="preserve">En tant qu'architecte, je veux une </w:t>
+            </w:r>
+            <w:r>
+              <w:rPr>
+                <w:b/>
+              </w:rPr>
+              <w:t>ADR de migration scalable</w:t>
+            </w:r>
+            <w:r>
+              <w:t xml:space="preserve"> (cache/CDN/autoscaling) afin de tracer les choix avant de coder.</w:t>
+            </w:r>
+          </w:p>
+        </w:tc>
+        <w:tc>
+          <w:tcPr>
+            <w:tcW w:type="dxa" w:w="1440"/>
+          </w:tcPr>
+          <w:p>
+            <w:r/>
+            <w:r>
+              <w:t>R1/R6</w:t>
+            </w:r>
+          </w:p>
+        </w:tc>
+        <w:tc>
+          <w:tcPr>
+            <w:tcW w:type="dxa" w:w="1440"/>
+          </w:tcPr>
+          <w:p>
+            <w:r/>
+            <w:r>
+              <w:t>🟠 S</w:t>
+            </w:r>
+          </w:p>
+        </w:tc>
+        <w:tc>
+          <w:tcPr>
+            <w:tcW w:type="dxa" w:w="1440"/>
+          </w:tcPr>
+          <w:p>
+            <w:r/>
+            <w:r>
+              <w:t>8</w:t>
+            </w:r>
+          </w:p>
+        </w:tc>
+        <w:tc>
+          <w:tcPr>
+            <w:tcW w:type="dxa" w:w="1440"/>
+          </w:tcPr>
+          <w:p>
+            <w:r/>
+            <w:r>
+              <w:t>⬜</w:t>
+            </w:r>
+          </w:p>
+        </w:tc>
+      </w:tr>
+      <w:tr>
+        <w:tc>
+          <w:tcPr>
+            <w:tcW w:type="dxa" w:w="1440"/>
+          </w:tcPr>
+          <w:p>
+            <w:r/>
+            <w:r>
+              <w:t>US-SC.4</w:t>
+            </w:r>
+          </w:p>
+        </w:tc>
+        <w:tc>
+          <w:tcPr>
+            <w:tcW w:type="dxa" w:w="1440"/>
+          </w:tcPr>
+          <w:p>
+            <w:r/>
+            <w:r>
+              <w:t xml:space="preserve">En tant qu'équipe produit, nous voulons une </w:t>
+            </w:r>
+            <w:r>
+              <w:rPr>
+                <w:b/>
+              </w:rPr>
+              <w:t>observabilité FinOps</w:t>
+            </w:r>
+            <w:r>
+              <w:t xml:space="preserve"> (quotas, métriques coûts) afin de maîtriser la levée et l'infra.</w:t>
+            </w:r>
+          </w:p>
+        </w:tc>
+        <w:tc>
+          <w:tcPr>
+            <w:tcW w:type="dxa" w:w="1440"/>
+          </w:tcPr>
+          <w:p>
+            <w:r/>
+            <w:r>
+              <w:t>R7</w:t>
+            </w:r>
+          </w:p>
+        </w:tc>
+        <w:tc>
+          <w:tcPr>
+            <w:tcW w:type="dxa" w:w="1440"/>
+          </w:tcPr>
+          <w:p>
+            <w:r/>
+            <w:r>
+              <w:t>🟡 C</w:t>
+            </w:r>
+          </w:p>
+        </w:tc>
+        <w:tc>
+          <w:tcPr>
+            <w:tcW w:type="dxa" w:w="1440"/>
+          </w:tcPr>
+          <w:p>
+            <w:r/>
+            <w:r>
+              <w:t>5</w:t>
+            </w:r>
+          </w:p>
+        </w:tc>
+        <w:tc>
+          <w:tcPr>
+            <w:tcW w:type="dxa" w:w="1440"/>
+          </w:tcPr>
+          <w:p>
+            <w:r/>
+            <w:r>
+              <w:t>⬜</w:t>
+            </w:r>
+          </w:p>
+        </w:tc>
+      </w:tr>
+    </w:tbl>
+    <w:p/>
+    <w:p>
+      <w:pPr>
+        <w:pStyle w:val="Heading1"/>
+      </w:pPr>
+      <w:r>
+        <w:t>E15 — Accessibilité RGAA</w:t>
+      </w:r>
+    </w:p>
+    <w:tbl>
+      <w:tblPr>
+        <w:tblStyle w:val="LightGrid-Accent1"/>
+        <w:tblW w:type="auto" w:w="0"/>
+        <w:jc w:val="center"/>
+        <w:tblLook w:firstColumn="1" w:firstRow="1" w:lastColumn="0" w:lastRow="0" w:noHBand="0" w:noVBand="1" w:val="04A0"/>
+      </w:tblPr>
+      <w:tblGrid>
+        <w:gridCol w:w="1440"/>
+        <w:gridCol w:w="1440"/>
+        <w:gridCol w:w="1440"/>
+        <w:gridCol w:w="1440"/>
+        <w:gridCol w:w="1440"/>
+        <w:gridCol w:w="1440"/>
+      </w:tblGrid>
+      <w:tr>
+        <w:tc>
+          <w:tcPr>
+            <w:tcW w:type="dxa" w:w="1440"/>
+          </w:tcPr>
+          <w:p>
+            <w:r/>
+            <w:r>
+              <w:rPr>
+                <w:b/>
+              </w:rPr>
+              <w:t>ID</w:t>
+            </w:r>
+          </w:p>
+        </w:tc>
+        <w:tc>
+          <w:tcPr>
+            <w:tcW w:type="dxa" w:w="1440"/>
+          </w:tcPr>
+          <w:p>
+            <w:r/>
+            <w:r>
+              <w:rPr>
+                <w:b/>
+              </w:rPr>
+              <w:t>User Story</w:t>
+            </w:r>
+          </w:p>
+        </w:tc>
+        <w:tc>
+          <w:tcPr>
+            <w:tcW w:type="dxa" w:w="1440"/>
+          </w:tcPr>
+          <w:p>
+            <w:r/>
+            <w:r>
+              <w:rPr>
+                <w:b/>
+              </w:rPr>
+              <w:t>Risque couvert</w:t>
+            </w:r>
+          </w:p>
+        </w:tc>
+        <w:tc>
+          <w:tcPr>
+            <w:tcW w:type="dxa" w:w="1440"/>
+          </w:tcPr>
+          <w:p>
+            <w:r/>
+            <w:r>
+              <w:rPr>
+                <w:b/>
+              </w:rPr>
+              <w:t>MoSCoW</w:t>
+            </w:r>
+          </w:p>
+        </w:tc>
+        <w:tc>
+          <w:tcPr>
+            <w:tcW w:type="dxa" w:w="1440"/>
+          </w:tcPr>
+          <w:p>
+            <w:r/>
+            <w:r>
+              <w:rPr>
+                <w:b/>
+              </w:rPr>
+              <w:t>Pts</w:t>
+            </w:r>
+          </w:p>
+        </w:tc>
+        <w:tc>
+          <w:tcPr>
+            <w:tcW w:type="dxa" w:w="1440"/>
+          </w:tcPr>
+          <w:p>
+            <w:r/>
+            <w:r>
+              <w:rPr>
+                <w:b/>
+              </w:rPr>
+              <w:t>État code</w:t>
+            </w:r>
+          </w:p>
+        </w:tc>
+      </w:tr>
+      <w:tr>
+        <w:tc>
+          <w:tcPr>
+            <w:tcW w:type="dxa" w:w="1440"/>
+          </w:tcPr>
+          <w:p>
+            <w:r/>
+            <w:r>
+              <w:t>US-A11Y.1</w:t>
+            </w:r>
+          </w:p>
+        </w:tc>
+        <w:tc>
+          <w:tcPr>
+            <w:tcW w:type="dxa" w:w="1440"/>
+          </w:tcPr>
+          <w:p>
+            <w:r/>
+            <w:r>
+              <w:t xml:space="preserve">En tant qu'utilisateur en situation de handicap, je veux une application </w:t>
+            </w:r>
+            <w:r>
+              <w:rPr>
+                <w:b/>
+              </w:rPr>
+              <w:t>conforme RGAA en priorité</w:t>
+            </w:r>
+            <w:r>
+              <w:t xml:space="preserve"> (contraste, clavier, ARIA) afin de réviser sans barrière.</w:t>
+            </w:r>
+          </w:p>
+        </w:tc>
+        <w:tc>
+          <w:tcPr>
+            <w:tcW w:type="dxa" w:w="1440"/>
+          </w:tcPr>
+          <w:p>
+            <w:r/>
+            <w:r>
+              <w:t>R3</w:t>
+            </w:r>
+          </w:p>
+        </w:tc>
+        <w:tc>
+          <w:tcPr>
+            <w:tcW w:type="dxa" w:w="1440"/>
+          </w:tcPr>
+          <w:p>
+            <w:r/>
+            <w:r>
+              <w:t>🔴 M</w:t>
+            </w:r>
+          </w:p>
+        </w:tc>
+        <w:tc>
+          <w:tcPr>
+            <w:tcW w:type="dxa" w:w="1440"/>
+          </w:tcPr>
+          <w:p>
+            <w:r/>
+            <w:r>
+              <w:t>8</w:t>
+            </w:r>
+          </w:p>
+        </w:tc>
+        <w:tc>
+          <w:tcPr>
+            <w:tcW w:type="dxa" w:w="1440"/>
+          </w:tcPr>
+          <w:p>
+            <w:r/>
+            <w:r>
+              <w:t>⬜</w:t>
+            </w:r>
+          </w:p>
+        </w:tc>
+      </w:tr>
+      <w:tr>
+        <w:tc>
+          <w:tcPr>
+            <w:tcW w:type="dxa" w:w="1440"/>
+          </w:tcPr>
+          <w:p>
+            <w:r/>
+            <w:r>
+              <w:t>US-A11Y.2</w:t>
+            </w:r>
+          </w:p>
+        </w:tc>
+        <w:tc>
+          <w:tcPr>
+            <w:tcW w:type="dxa" w:w="1440"/>
+          </w:tcPr>
+          <w:p>
+            <w:r/>
+            <w:r>
+              <w:t xml:space="preserve">En tant qu'équipe, nous voulons des </w:t>
+            </w:r>
+            <w:r>
+              <w:rPr>
+                <w:b/>
+              </w:rPr>
+              <w:t>tests d'accessibilité automatisés</w:t>
+            </w:r>
+            <w:r>
+              <w:t xml:space="preserve"> (axe-core en CI) afin d'éviter les régressions RGAA.</w:t>
+            </w:r>
+          </w:p>
+        </w:tc>
+        <w:tc>
+          <w:tcPr>
+            <w:tcW w:type="dxa" w:w="1440"/>
+          </w:tcPr>
+          <w:p>
+            <w:r/>
+            <w:r>
+              <w:t>R3</w:t>
+            </w:r>
+          </w:p>
+        </w:tc>
+        <w:tc>
+          <w:tcPr>
+            <w:tcW w:type="dxa" w:w="1440"/>
+          </w:tcPr>
+          <w:p>
+            <w:r/>
+            <w:r>
+              <w:t>🟠 S</w:t>
+            </w:r>
+          </w:p>
+        </w:tc>
+        <w:tc>
+          <w:tcPr>
+            <w:tcW w:type="dxa" w:w="1440"/>
+          </w:tcPr>
+          <w:p>
+            <w:r/>
+            <w:r>
+              <w:t>5</w:t>
+            </w:r>
+          </w:p>
+        </w:tc>
+        <w:tc>
+          <w:tcPr>
+            <w:tcW w:type="dxa" w:w="1440"/>
+          </w:tcPr>
+          <w:p>
+            <w:r/>
+            <w:r>
+              <w:t>⬜</w:t>
+            </w:r>
+          </w:p>
+        </w:tc>
+      </w:tr>
+    </w:tbl>
+    <w:p/>
+    <w:p>
+      <w:pPr>
+        <w:pStyle w:val="Heading1"/>
+      </w:pPr>
+      <w:r>
+        <w:t>E16 — Internationalisation i18n</w:t>
+      </w:r>
+    </w:p>
+    <w:tbl>
+      <w:tblPr>
+        <w:tblStyle w:val="LightGrid-Accent1"/>
+        <w:tblW w:type="auto" w:w="0"/>
+        <w:jc w:val="center"/>
+        <w:tblLook w:firstColumn="1" w:firstRow="1" w:lastColumn="0" w:lastRow="0" w:noHBand="0" w:noVBand="1" w:val="04A0"/>
+      </w:tblPr>
+      <w:tblGrid>
+        <w:gridCol w:w="1440"/>
+        <w:gridCol w:w="1440"/>
+        <w:gridCol w:w="1440"/>
+        <w:gridCol w:w="1440"/>
+        <w:gridCol w:w="1440"/>
+        <w:gridCol w:w="1440"/>
+      </w:tblGrid>
+      <w:tr>
+        <w:tc>
+          <w:tcPr>
+            <w:tcW w:type="dxa" w:w="1440"/>
+          </w:tcPr>
+          <w:p>
+            <w:r/>
+            <w:r>
+              <w:rPr>
+                <w:b/>
+              </w:rPr>
+              <w:t>ID</w:t>
+            </w:r>
+          </w:p>
+        </w:tc>
+        <w:tc>
+          <w:tcPr>
+            <w:tcW w:type="dxa" w:w="1440"/>
+          </w:tcPr>
+          <w:p>
+            <w:r/>
+            <w:r>
+              <w:rPr>
+                <w:b/>
+              </w:rPr>
+              <w:t>User Story</w:t>
+            </w:r>
+          </w:p>
+        </w:tc>
+        <w:tc>
+          <w:tcPr>
+            <w:tcW w:type="dxa" w:w="1440"/>
+          </w:tcPr>
+          <w:p>
+            <w:r/>
+            <w:r>
+              <w:rPr>
+                <w:b/>
+              </w:rPr>
+              <w:t>Risque couvert</w:t>
+            </w:r>
+          </w:p>
+        </w:tc>
+        <w:tc>
+          <w:tcPr>
+            <w:tcW w:type="dxa" w:w="1440"/>
+          </w:tcPr>
+          <w:p>
+            <w:r/>
+            <w:r>
+              <w:rPr>
+                <w:b/>
+              </w:rPr>
+              <w:t>MoSCoW</w:t>
+            </w:r>
+          </w:p>
+        </w:tc>
+        <w:tc>
+          <w:tcPr>
+            <w:tcW w:type="dxa" w:w="1440"/>
+          </w:tcPr>
+          <w:p>
+            <w:r/>
+            <w:r>
+              <w:rPr>
+                <w:b/>
+              </w:rPr>
+              <w:t>Pts</w:t>
+            </w:r>
+          </w:p>
+        </w:tc>
+        <w:tc>
+          <w:tcPr>
+            <w:tcW w:type="dxa" w:w="1440"/>
+          </w:tcPr>
+          <w:p>
+            <w:r/>
+            <w:r>
+              <w:rPr>
+                <w:b/>
+              </w:rPr>
+              <w:t>État code</w:t>
+            </w:r>
+          </w:p>
+        </w:tc>
+      </w:tr>
+      <w:tr>
+        <w:tc>
+          <w:tcPr>
+            <w:tcW w:type="dxa" w:w="1440"/>
+          </w:tcPr>
+          <w:p>
+            <w:r/>
+            <w:r>
+              <w:t>US-I18N.1</w:t>
+            </w:r>
+          </w:p>
+        </w:tc>
+        <w:tc>
+          <w:tcPr>
+            <w:tcW w:type="dxa" w:w="1440"/>
+          </w:tcPr>
+          <w:p>
+            <w:r/>
+            <w:r>
+              <w:t xml:space="preserve">En tant que lycéen international, je veux une </w:t>
+            </w:r>
+            <w:r>
+              <w:rPr>
+                <w:b/>
+              </w:rPr>
+              <w:t>interface multilingue</w:t>
+            </w:r>
+            <w:r>
+              <w:t xml:space="preserve"> (FR/EN, extensible) afin d'utiliser EduTutor IA hors France.</w:t>
+            </w:r>
+          </w:p>
+        </w:tc>
+        <w:tc>
+          <w:tcPr>
+            <w:tcW w:type="dxa" w:w="1440"/>
+          </w:tcPr>
+          <w:p>
+            <w:r/>
+            <w:r>
+              <w:t>i18n</w:t>
+            </w:r>
+          </w:p>
+        </w:tc>
+        <w:tc>
+          <w:tcPr>
+            <w:tcW w:type="dxa" w:w="1440"/>
+          </w:tcPr>
+          <w:p>
+            <w:r/>
+            <w:r>
+              <w:t>🟠 S</w:t>
+            </w:r>
+          </w:p>
+        </w:tc>
+        <w:tc>
+          <w:tcPr>
+            <w:tcW w:type="dxa" w:w="1440"/>
+          </w:tcPr>
+          <w:p>
+            <w:r/>
+            <w:r>
+              <w:t>8</w:t>
+            </w:r>
+          </w:p>
+        </w:tc>
+        <w:tc>
+          <w:tcPr>
+            <w:tcW w:type="dxa" w:w="1440"/>
+          </w:tcPr>
+          <w:p>
+            <w:r/>
+            <w:r>
+              <w:t>⬜</w:t>
+            </w:r>
+          </w:p>
+        </w:tc>
+      </w:tr>
+      <w:tr>
+        <w:tc>
+          <w:tcPr>
+            <w:tcW w:type="dxa" w:w="1440"/>
+          </w:tcPr>
+          <w:p>
+            <w:r/>
+            <w:r>
+              <w:t>US-I18N.2</w:t>
+            </w:r>
+          </w:p>
+        </w:tc>
+        <w:tc>
+          <w:tcPr>
+            <w:tcW w:type="dxa" w:w="1440"/>
+          </w:tcPr>
+          <w:p>
+            <w:r/>
+            <w:r>
+              <w:t xml:space="preserve">En tant qu'utilisateur, je veux des </w:t>
+            </w:r>
+            <w:r>
+              <w:rPr>
+                <w:b/>
+              </w:rPr>
+              <w:t>réponses IA dans ma langue</w:t>
+            </w:r>
+            <w:r>
+              <w:t xml:space="preserve"> (détection + prompts localisés) afin d'obtenir des quiz pédagogiques cohérents.</w:t>
+            </w:r>
+          </w:p>
+        </w:tc>
+        <w:tc>
+          <w:tcPr>
+            <w:tcW w:type="dxa" w:w="1440"/>
+          </w:tcPr>
+          <w:p>
+            <w:r/>
+            <w:r>
+              <w:t>R4</w:t>
+            </w:r>
+          </w:p>
+        </w:tc>
+        <w:tc>
+          <w:tcPr>
+            <w:tcW w:type="dxa" w:w="1440"/>
+          </w:tcPr>
+          <w:p>
+            <w:r/>
+            <w:r>
+              <w:t>🟠 S</w:t>
+            </w:r>
+          </w:p>
+        </w:tc>
+        <w:tc>
+          <w:tcPr>
+            <w:tcW w:type="dxa" w:w="1440"/>
+          </w:tcPr>
+          <w:p>
+            <w:r/>
+            <w:r>
+              <w:t>8</w:t>
+            </w:r>
+          </w:p>
+        </w:tc>
+        <w:tc>
+          <w:tcPr>
+            <w:tcW w:type="dxa" w:w="1440"/>
+          </w:tcPr>
+          <w:p>
+            <w:r/>
+            <w:r>
+              <w:t>⬜</w:t>
+            </w:r>
+          </w:p>
+        </w:tc>
+      </w:tr>
+      <w:tr>
+        <w:tc>
+          <w:tcPr>
+            <w:tcW w:type="dxa" w:w="1440"/>
+          </w:tcPr>
+          <w:p>
+            <w:r/>
+            <w:r>
+              <w:t>US-RGPD-INT.1</w:t>
+            </w:r>
+          </w:p>
+        </w:tc>
+        <w:tc>
+          <w:tcPr>
+            <w:tcW w:type="dxa" w:w="1440"/>
+          </w:tcPr>
+          <w:p>
+            <w:r/>
+            <w:r>
+              <w:t xml:space="preserve">En tant que DPO, je veux un </w:t>
+            </w:r>
+            <w:r>
+              <w:rPr>
+                <w:b/>
+              </w:rPr>
+              <w:t>hébergement UE + DPA documentés</w:t>
+            </w:r>
+            <w:r>
+              <w:t xml:space="preserve"> afin de maîtriser les transferts à l'international.</w:t>
+            </w:r>
+          </w:p>
+        </w:tc>
+        <w:tc>
+          <w:tcPr>
+            <w:tcW w:type="dxa" w:w="1440"/>
+          </w:tcPr>
+          <w:p>
+            <w:r/>
+            <w:r>
+              <w:t>R5</w:t>
+            </w:r>
+          </w:p>
+        </w:tc>
+        <w:tc>
+          <w:tcPr>
+            <w:tcW w:type="dxa" w:w="1440"/>
+          </w:tcPr>
+          <w:p>
+            <w:r/>
+            <w:r>
+              <w:t>🔴 M</w:t>
+            </w:r>
+          </w:p>
+        </w:tc>
+        <w:tc>
+          <w:tcPr>
+            <w:tcW w:type="dxa" w:w="1440"/>
+          </w:tcPr>
+          <w:p>
+            <w:r/>
+            <w:r>
+              <w:t>5</w:t>
+            </w:r>
+          </w:p>
+        </w:tc>
+        <w:tc>
+          <w:tcPr>
+            <w:tcW w:type="dxa" w:w="1440"/>
+          </w:tcPr>
+          <w:p>
+            <w:r/>
+            <w:r>
+              <w:t>⬜</w:t>
+            </w:r>
+          </w:p>
+        </w:tc>
+      </w:tr>
+    </w:tbl>
+    <w:p/>
+    <w:p>
+      <w:pPr>
+        <w:pStyle w:val="Heading1"/>
+      </w:pPr>
+      <w:r>
         <w:t>⚪ Won't have (this time)</w:t>
       </w:r>
     </w:p>
@@ -8458,21 +9713,21 @@
               <w:rPr>
                 <w:b/>
               </w:rPr>
-              <w:t>Runbook crise</w:t>
-            </w:r>
-            <w:r>
-              <w:t xml:space="preserve"> : procédure incident + rollback + post-mortem</w:t>
-            </w:r>
-          </w:p>
-        </w:tc>
-        <w:tc>
-          <w:tcPr>
-            <w:tcW w:type="dxa" w:w="1728"/>
-          </w:tcPr>
-          <w:p>
-            <w:r/>
-            <w:r>
-              <w:t>P5 (jeu. 10h)</w:t>
+              <w:t>Passage à l'échelle</w:t>
+            </w:r>
+            <w:r>
+              <w:t xml:space="preserve"> : risques, backlog préventif, burndown/burnup</w:t>
+            </w:r>
+          </w:p>
+        </w:tc>
+        <w:tc>
+          <w:tcPr>
+            <w:tcW w:type="dxa" w:w="1728"/>
+          </w:tcPr>
+          <w:p>
+            <w:r/>
+            <w:r>
+              <w:t>P5 / J4 (jeu. 10h)</w:t>
             </w:r>
           </w:p>
         </w:tc>
@@ -8494,7 +9749,7 @@
           <w:p>
             <w:r/>
             <w:r>
-              <w:t>Runbook + template post-mortem</w:t>
+              <w:t>Matrice risques + actions E14/E15/E16 + burnup actualisé</w:t>
             </w:r>
           </w:p>
         </w:tc>
@@ -9415,6 +10670,72 @@
           </w:p>
         </w:tc>
       </w:tr>
+      <w:tr>
+        <w:tc>
+          <w:tcPr>
+            <w:tcW w:type="dxa" w:w="1728"/>
+          </w:tcPr>
+          <w:p>
+            <w:r/>
+            <w:r>
+              <w:rPr>
+                <w:b/>
+              </w:rPr>
+              <w:t>R3 — Plateforme publique J4</w:t>
+            </w:r>
+            <w:r>
+              <w:t xml:space="preserve"> (E14–E16 + RGPD international)</w:t>
+            </w:r>
+          </w:p>
+        </w:tc>
+        <w:tc>
+          <w:tcPr>
+            <w:tcW w:type="dxa" w:w="1728"/>
+          </w:tcPr>
+          <w:p>
+            <w:r/>
+            <w:r>
+              <w:t>26</w:t>
+            </w:r>
+          </w:p>
+        </w:tc>
+        <w:tc>
+          <w:tcPr>
+            <w:tcW w:type="dxa" w:w="1728"/>
+          </w:tcPr>
+          <w:p>
+            <w:r/>
+            <w:r>
+              <w:t>29</w:t>
+            </w:r>
+          </w:p>
+        </w:tc>
+        <w:tc>
+          <w:tcPr>
+            <w:tcW w:type="dxa" w:w="1728"/>
+          </w:tcPr>
+          <w:p>
+            <w:r/>
+            <w:r>
+              <w:t>13</w:t>
+            </w:r>
+          </w:p>
+        </w:tc>
+        <w:tc>
+          <w:tcPr>
+            <w:tcW w:type="dxa" w:w="1728"/>
+          </w:tcPr>
+          <w:p>
+            <w:r/>
+            <w:r>
+              <w:rPr>
+                <w:b/>
+              </w:rPr>
+              <w:t>68</w:t>
+            </w:r>
+          </w:p>
+        </w:tc>
+      </w:tr>
     </w:tbl>
     <w:p/>
     <w:p>
@@ -9655,7 +10976,7 @@
           <w:p>
             <w:r/>
             <w:r>
-              <w:t>E11/E12 (R2), E9 livraison</w:t>
+              <w:t>Replanification J4 : E14 scalabilité, E15 RGAA, E16 i18n + R2 si capacité</w:t>
             </w:r>
           </w:p>
         </w:tc>
@@ -9666,7 +10987,7 @@
           <w:p>
             <w:r/>
             <w:r>
-              <w:t>P5 — Crise (10h)</w:t>
+              <w:t>P5 — Passage à l'échelle (10h)</w:t>
             </w:r>
           </w:p>
         </w:tc>
@@ -9769,10 +11090,10 @@
         <w:rPr>
           <w:b/>
         </w:rPr>
-        <w:t>Runbook crise</w:t>
+        <w:t>Passage à l'échelle J4</w:t>
       </w:r>
       <w:r>
-        <w:t xml:space="preserve"> (SPK-5) — prêt avant jeudi 10h.</w:t>
+        <w:t xml:space="preserve"> (SPK-5) — matrice risques + backlog préventif E14/E15/E16 + burnup actualisé.</w:t>
       </w:r>
     </w:p>
     <w:p>
@@ -9870,6 +11191,38 @@
         <w:rPr>
           <w:b/>
         </w:rPr>
+        <w:t>Risque J4</w:t>
+      </w:r>
+      <w:r>
+        <w:t xml:space="preserve"> : le passage à l'échelle ajoute </w:t>
+      </w:r>
+      <w:r>
+        <w:rPr>
+          <w:b/>
+        </w:rPr>
+        <w:t>68 points</w:t>
+      </w:r>
+      <w:r>
+        <w:t xml:space="preserve">. Le PO doit accepter une </w:t>
+      </w:r>
+      <w:r>
+        <w:rPr>
+          <w:b/>
+        </w:rPr>
+        <w:t>Release 3</w:t>
+      </w:r>
+      <w:r>
+        <w:t xml:space="preserve"> distincte plutôt qu'un empilement non piloté dans R2.</w:t>
+      </w:r>
+    </w:p>
+    <w:p>
+      <w:pPr>
+        <w:pStyle w:val="ListBullet"/>
+      </w:pPr>
+      <w:r>
+        <w:rPr>
+          <w:b/>
+        </w:rPr>
         <w:t>Décisions attendues du PO</w:t>
       </w:r>
       <w:r>
@@ -9882,7 +11235,16 @@
         <w:t>S</w:t>
       </w:r>
       <w:r>
-        <w:t xml:space="preserve"> à inclure dans le Sprint 1 ; (3) acter la réponse de principe à P1.</w:t>
+        <w:t xml:space="preserve"> à inclure dans le Sprint 1 ; (3) acter la réponse de principe à P1 ; (4) valider l'ordre J4 : </w:t>
+      </w:r>
+      <w:r>
+        <w:rPr>
+          <w:b/>
+        </w:rPr>
+        <w:t>RGAA et scalabilité en Must</w:t>
+      </w:r>
+      <w:r>
+        <w:t>, i18n en Should.</w:t>
       </w:r>
     </w:p>
     <w:p>
@@ -10190,6 +11552,41 @@
             <w:r/>
             <w:r>
               <w:t>§5 (E11–E12) + Won't have tracé.</w:t>
+            </w:r>
+          </w:p>
+        </w:tc>
+      </w:tr>
+      <w:tr>
+        <w:tc>
+          <w:tcPr>
+            <w:tcW w:type="dxa" w:w="2880"/>
+          </w:tcPr>
+          <w:p>
+            <w:r/>
+            <w:r>
+              <w:t>Release 3 J4 cadrée</w:t>
+            </w:r>
+          </w:p>
+        </w:tc>
+        <w:tc>
+          <w:tcPr>
+            <w:tcW w:type="dxa" w:w="2880"/>
+          </w:tcPr>
+          <w:p>
+            <w:r/>
+            <w:r>
+              <w:t>☑ Oui</w:t>
+            </w:r>
+          </w:p>
+        </w:tc>
+        <w:tc>
+          <w:tcPr>
+            <w:tcW w:type="dxa" w:w="2880"/>
+          </w:tcPr>
+          <w:p>
+            <w:r/>
+            <w:r>
+              <w:t>§5bis : E14/E15/E16 + 68 pts de scope préventif.</w:t>
             </w:r>
           </w:p>
         </w:tc>

</xml_diff>